<commit_message>
more class demo changes
</commit_message>
<xml_diff>
--- a/Week03-WordOffice/Homework/ClassDemo.docx
+++ b/Week03-WordOffice/Homework/ClassDemo.docx
@@ -60,6 +60,7 @@
           <w:docPartUnique/>
         </w:docPartObj>
       </w:sdtPr>
+      <w:sdtEndPr/>
       <w:sdtContent>
         <w:p>
           <w:pPr>
@@ -327,14 +328,12 @@
         </w:rPr>
         <w:t xml:space="preserve">faucibus </w:t>
       </w:r>
-      <w:proofErr w:type="spellStart"/>
       <w:r>
         <w:rPr>
           <w:rStyle w:val="Emphasis"/>
         </w:rPr>
         <w:t>sollicitudin</w:t>
       </w:r>
-      <w:proofErr w:type="spellEnd"/>
       <w:r>
         <w:rPr>
           <w:noProof/>
@@ -355,32 +354,56 @@
         </w:rPr>
         <w:t xml:space="preserve">Mauris bibendum ipsum in </w:t>
       </w:r>
-      <w:proofErr w:type="spellStart"/>
       <w:r>
         <w:rPr>
           <w:rStyle w:val="Strong"/>
         </w:rPr>
         <w:t>eleifend</w:t>
       </w:r>
-      <w:proofErr w:type="spellEnd"/>
       <w:r>
         <w:rPr>
           <w:noProof/>
         </w:rPr>
-        <w:t xml:space="preserve"> molestie. Aenean sed volutpat felis, porta consequat dolor. Sed volutpat, ligula ac rhoncus semper, ex magna faucibus odio, non euismod lacus nulla nec mi. Fusce facilisis efficitur nulla sed porta.</w:t>
+        <w:t xml:space="preserve"> molestie. Aenean sed volutpat felis, porta consequat dolor. Sed volutpat, </w:t>
       </w:r>
-    </w:p>
-    <w:p>
-      <w:pPr>
+      <w:r>
         <w:rPr>
-          <w:noProof/>
+          <w:rStyle w:val="Emphasis"/>
         </w:rPr>
-      </w:pPr>
+        <w:t>ligula</w:t>
+      </w:r>
       <w:r>
         <w:rPr>
           <w:noProof/>
         </w:rPr>
-        <w:t xml:space="preserve">Quisque eget pulvinar libero. Proin tempus aliquet sem, ut pellentesque nunc auctor nec. Donec rhoncus sit amet libero a vehicula. Nullam at velit aliquet, porttitor ante quis, mollis nibh. </w:t>
+        <w:t xml:space="preserve"> ac rhoncus semper, ex magna faucibus odio, non euismod lacus nulla nec mi. Fusce facilisis efficitur nulla sed porta.</w:t>
+      </w:r>
+    </w:p>
+    <w:p>
+      <w:pPr>
+        <w:rPr>
+          <w:noProof/>
+        </w:rPr>
+      </w:pPr>
+      <w:r>
+        <w:rPr>
+          <w:noProof/>
+        </w:rPr>
+        <w:t xml:space="preserve">Quisque eget pulvinar libero. Proin </w:t>
+      </w:r>
+      <w:r>
+        <w:rPr>
+          <w:b/>
+          <w:bCs/>
+          <w:noProof/>
+        </w:rPr>
+        <w:t>tempus</w:t>
+      </w:r>
+      <w:r>
+        <w:rPr>
+          <w:noProof/>
+        </w:rPr>
+        <w:t xml:space="preserve"> aliquet sem, ut pellentesque nunc auctor nec. Donec rhoncus sit amet libero a vehicula. Nullam at velit aliquet, porttitor ante quis, mollis nibh. </w:t>
       </w:r>
     </w:p>
     <w:p>
@@ -572,11 +595,9 @@
       </w:r>
     </w:p>
     <w:p>
-      <w:proofErr w:type="spellStart"/>
       <w:r>
         <w:t>Fjksajfldajkfioewakjfdla</w:t>
       </w:r>
-      <w:proofErr w:type="spellEnd"/>
     </w:p>
     <w:p>
       <w:pPr>
@@ -658,13 +679,8 @@
             <w:pPr>
               <w:pStyle w:val="TableText"/>
             </w:pPr>
-            <w:proofErr w:type="spellStart"/>
             <w:r>
-              <w:t>Hre</w:t>
-            </w:r>
-            <w:proofErr w:type="spellEnd"/>
-            <w:r>
-              <w:t xml:space="preserve"> is table text</w:t>
+              <w:t>Hre is table text</w:t>
             </w:r>
           </w:p>
         </w:tc>
@@ -4209,7 +4225,7 @@
   <w:style w:type="paragraph" w:default="1" w:styleId="Normal">
     <w:name w:val="Normal"/>
     <w:aliases w:val="Body"/>
-    <w:rsid w:val="00AF2B95"/>
+    <w:rsid w:val="00101A4A"/>
     <w:rPr>
       <w:rFonts w:ascii="Roboto" w:hAnsi="Roboto"/>
       <w:sz w:val="20"/>

</xml_diff>